<commit_message>
AIRARABIA corrected on the growth-basis error
Its terminal was handed a profit figure, a depreciation charge and a working
capital balance all already grown by (1+g), which the sanctioned construction
grows again. On a name whose terminal is 96% OF ENTERPRISE VALUE that is
nearly the whole error.

Central 4.8511 -> 4.7459, gap -2.4% -> -4.5%, still inside the band so no
review is owed. The terminal lever reads 4.2948 corrected, against the 4.39 it
carried, and the route is 4.1745 -> 4.2948 -> 4.7171 -> 4.7459.

All three of its scenario paths carried the same error and all three are
corrected, not just the headline call.

Study checks: recalc 663 of 663 formula cells with 49 headline
reconciliations, 32 drivers, 28 tables 0 unreconciled, 313 prose figures 0
unmatched.

Three studies remain: EMPOWER, DU, MODON.

Co-Authored-By: Claude Opus 5 <noreply@anthropic.com>
Claude-Session: https://claude.ai/code/session_017RcjXG4ETjADcoFJf123yY
</commit_message>
<xml_diff>
--- a/engine/airarabia_study/AIRARABIA_Valuation_Study_09-08-2026_public.docx
+++ b/engine/airarabia_study/AIRARABIA_Valuation_Study_09-08-2026_public.docx
@@ -225,7 +225,7 @@
           <w:color w:val="1C3A36"/>
           <w:sz w:val="21"/>
         </w:rPr>
-        <w:t xml:space="preserve">Fair value clusters at AED 4.85 per share on the base framing and AED 5.40 with the joint-venture network capitalised — against a market price of AED 4.97. </w:t>
+        <w:t xml:space="preserve">Fair value clusters at AED 4.75 per share on the base framing and AED 5.29 with the joint-venture network capitalised — against a market price of AED 4.97. </w:t>
       </w:r>
       <w:r>
         <w:rPr>
@@ -234,7 +234,7 @@
           <w:color w:val="1C3A36"/>
           <w:sz w:val="21"/>
         </w:rPr>
-        <w:t>The market is paying about +2% above the base fundamental central (equivalently, the central sits -2% below the market — the same figure the summary table carries); the gap is, in large part, a price on two things this study deliberately prices both ways: cheaper fuel from 2027 and the five equity-accounted airlines the balance sheet carries at less than two times their annual profit contribution.</w:t>
+        <w:t>The market is paying about +5% above the base fundamental central (equivalently, the central sits -5% below the market — the same figure the summary table carries); the gap is, in large part, a price on two things this study deliberately prices both ways: cheaper fuel from 2027 and the five equity-accounted airlines the balance sheet carries at less than two times their annual profit contribution.</w:t>
       </w:r>
     </w:p>
     <w:p>
@@ -457,7 +457,7 @@
                 <w:color w:val="1C3A36"/>
                 <w:sz w:val="18"/>
               </w:rPr>
-              <w:t>1.12</w:t>
+              <w:t>1.08</w:t>
             </w:r>
           </w:p>
         </w:tc>
@@ -475,7 +475,7 @@
                 <w:color w:val="1C3A36"/>
                 <w:sz w:val="18"/>
               </w:rPr>
-              <w:t>4.85</w:t>
+              <w:t>4.75</w:t>
             </w:r>
           </w:p>
         </w:tc>
@@ -493,7 +493,7 @@
                 <w:color w:val="1C3A36"/>
                 <w:sz w:val="18"/>
               </w:rPr>
-              <w:t>7.04</w:t>
+              <w:t>6.91</w:t>
             </w:r>
           </w:p>
         </w:tc>
@@ -529,7 +529,7 @@
                 <w:color w:val="1C3A36"/>
                 <w:sz w:val="18"/>
               </w:rPr>
-              <w:t>-2%</w:t>
+              <w:t>-5%</w:t>
             </w:r>
           </w:p>
         </w:tc>
@@ -788,7 +788,7 @@
                 <w:color w:val="1C3A36"/>
                 <w:sz w:val="18"/>
               </w:rPr>
-              <w:t>1.12</w:t>
+              <w:t>1.08</w:t>
             </w:r>
           </w:p>
         </w:tc>
@@ -808,7 +808,7 @@
                 <w:color w:val="1C3A36"/>
                 <w:sz w:val="18"/>
               </w:rPr>
-              <w:t>4.85</w:t>
+              <w:t>4.75</w:t>
             </w:r>
           </w:p>
         </w:tc>
@@ -828,7 +828,7 @@
                 <w:color w:val="1C3A36"/>
                 <w:sz w:val="18"/>
               </w:rPr>
-              <w:t>7.04</w:t>
+              <w:t>6.91</w:t>
             </w:r>
           </w:p>
         </w:tc>
@@ -868,7 +868,7 @@
                 <w:color w:val="1C3A36"/>
                 <w:sz w:val="18"/>
               </w:rPr>
-              <w:t>-2%</w:t>
+              <w:t>-5%</w:t>
             </w:r>
           </w:p>
         </w:tc>
@@ -1032,7 +1032,7 @@
                 <w:color w:val="1C3A36"/>
                 <w:sz w:val="18"/>
               </w:rPr>
-              <w:t>4.42</w:t>
+              <w:t>4.37</w:t>
             </w:r>
           </w:p>
         </w:tc>
@@ -1086,7 +1086,7 @@
                 <w:color w:val="1C3A36"/>
                 <w:sz w:val="18"/>
               </w:rPr>
-              <w:t>-11%</w:t>
+              <w:t>-12%</w:t>
             </w:r>
           </w:p>
         </w:tc>
@@ -1215,7 +1215,7 @@
                 <w:color w:val="1C3A36"/>
                 <w:sz w:val="18"/>
               </w:rPr>
-              <w:t>5.40</w:t>
+              <w:t>5.29</w:t>
             </w:r>
           </w:p>
         </w:tc>
@@ -1233,7 +1233,7 @@
                 <w:color w:val="1C3A36"/>
                 <w:sz w:val="18"/>
               </w:rPr>
-              <w:t>+9%</w:t>
+              <w:t>+7%</w:t>
             </w:r>
           </w:p>
         </w:tc>
@@ -1270,7 +1270,7 @@
                 <w:color w:val="1C3A36"/>
                 <w:sz w:val="18"/>
               </w:rPr>
-              <w:t>2.75</w:t>
+              <w:t>2.69</w:t>
             </w:r>
           </w:p>
         </w:tc>
@@ -1288,7 +1288,7 @@
                 <w:color w:val="1C3A36"/>
                 <w:sz w:val="18"/>
               </w:rPr>
-              <w:t>-45%</w:t>
+              <w:t>-46%</w:t>
             </w:r>
           </w:p>
         </w:tc>
@@ -3140,7 +3140,7 @@
                 <w:color w:val="1C3A36"/>
                 <w:sz w:val="18"/>
               </w:rPr>
-              <w:t>18,221</w:t>
+              <w:t>17,756</w:t>
             </w:r>
           </w:p>
         </w:tc>
@@ -3177,7 +3177,7 @@
                 <w:color w:val="1C3A36"/>
                 <w:sz w:val="18"/>
               </w:rPr>
-              <w:t>19,022</w:t>
+              <w:t>18,557</w:t>
             </w:r>
           </w:p>
         </w:tc>
@@ -3403,7 +3403,7 @@
                 <w:color w:val="1C3A36"/>
                 <w:sz w:val="18"/>
               </w:rPr>
-              <w:t>22,871</w:t>
+              <w:t>22,406</w:t>
             </w:r>
           </w:p>
         </w:tc>
@@ -3444,7 +3444,7 @@
                 <w:color w:val="1C3A36"/>
                 <w:sz w:val="18"/>
               </w:rPr>
-              <w:t>AED 4.85</w:t>
+              <w:t>AED 4.75</w:t>
             </w:r>
           </w:p>
         </w:tc>
@@ -3485,7 +3485,7 @@
                 <w:color w:val="1C3A36"/>
                 <w:sz w:val="18"/>
               </w:rPr>
-              <w:t>AED 5.40</w:t>
+              <w:t>AED 5.29</w:t>
             </w:r>
           </w:p>
         </w:tc>
@@ -5411,7 +5411,7 @@
           <w:color w:val="1C3A36"/>
           <w:sz w:val="21"/>
         </w:rPr>
-        <w:t>Two judgements dominate this valuation, and both are sensitised in their own physical units. FUEL: straight from the model's own grid, at 92.5% of the base fuel path the DCF is AED 5.65 and at 107.5% it is AED 4.05 — about AED 0.80 per share for each 7.5% move in the fuel line (roughly AED 13 per passenger). Priced BOTH ways as full paths: base (official-curve relief) AED 4.85; association-assumption held high, AED 2.75. THE JV NETWORK: at the audited carrying value it contributes AED 0.08 per share; capitalised at 15× its AED 190mn profit share it contributes AED 0.61 — the 0.55 per-share gap between the two framings is the single largest contested item in the study; the three ventures disclosed in both years grew their combined 100%-basis profits ~70% in FY2025 (the group's share grew 52% — a mix effect: the highest-stake venture, Morocco, declined while Pakistan tripled), and a new Saudi carrier was signed. One housekeeping note a reader of the auditor's report will want: the 'shares purchased during the year' it references is the venture transaction disclosed in note 1 — Air Arabia Egypt raised from 40% to 49% — not a buyback; share capital is unchanged and no treasury shares exist.</w:t>
+        <w:t>Two judgements dominate this valuation, and both are sensitised in their own physical units. FUEL: straight from the model's own grid, at 92.5% of the base fuel path the DCF is AED 5.53 and at 107.5% it is AED 3.97 — about AED 0.78 per share for each 7.5% move in the fuel line (roughly AED 13 per passenger). Priced BOTH ways as full paths: base (official-curve relief) AED 4.75; association-assumption held high, AED 2.69. THE JV NETWORK: at the audited carrying value it contributes AED 0.08 per share; capitalised at 15× its AED 190mn profit share it contributes AED 0.61 — the 0.55 per-share gap between the two framings is the single largest contested item in the study; the three ventures disclosed in both years grew their combined 100%-basis profits ~70% in FY2025 (the group's share grew 52% — a mix effect: the highest-stake venture, Morocco, declined while Pakistan tripled), and a new Saudi carrier was signed. One housekeeping note a reader of the auditor's report will want: the 'shares purchased during the year' it references is the venture transaction disclosed in note 1 — Air Arabia Egypt raised from 40% to 49% — not a buyback; share capital is unchanged and no treasury shares exist.</w:t>
       </w:r>
     </w:p>
     <w:p>
@@ -5784,7 +5784,7 @@
                 <w:color w:val="1C3A36"/>
                 <w:sz w:val="17"/>
               </w:rPr>
-              <w:t>the identical regression against a Dubai general-index series that is held but is not the registered regressor: R² 0.40, 258 weeks, standard error 0.083, 90% interval 0.95–1.22. It is the HIGHER beta and explains three times as much of this share's weekly movement, so on the evidence it is the better measurement — and it would LOWER the valuation. It is published rather than used because which index a beta is measured against is a matter of method, settled once for every company, not something one study decides for itself. Priced in full: cost of equity 9.73%, cost of capital 9.19%, cash-flow value AED 3.91 per share (-0.94, -19%)</w:t>
+              <w:t>the identical regression against a Dubai general-index series that is held but is not the registered regressor: R² 0.40, 258 weeks, standard error 0.083, 90% interval 0.95–1.22. It is the HIGHER beta and explains three times as much of this share's weekly movement, so on the evidence it is the better measurement — and it would LOWER the valuation. It is published rather than used because which index a beta is measured against is a matter of method, settled once for every company, not something one study decides for itself. Priced in full: cost of equity 9.73%, cost of capital 9.19%, cash-flow value AED 3.83 per share (-0.92, -19%)</w:t>
             </w:r>
           </w:p>
         </w:tc>
@@ -6564,7 +6564,7 @@
           <w:color w:val="1C3A36"/>
           <w:sz w:val="21"/>
         </w:rPr>
-        <w:t>On the index the beta is measured against — stated plainly, because it is the second most consequential number in this valuation after the fuel path. This share is listed in Dubai, and the natural regressor would be a Dubai general index. No Dubai general-index series is held for this purpose, so every company measured this way stands on the FTSE Abu Dhabi general index instead, one UAE market proxy standing in for the other. That substitution is better supported than it sounds: across five years of weekly returns the Abu Dhabi index explains the Dubai-listed shares BETTER than it explains the Abu Dhabi-listed ones it actually covers (median R² 0.240 against 0.127), and every one of those Dubai names clears the minimum usability threshold. It is nonetheless a substitute, and for THIS share it is the weaker of the two available measurements: 0.40 against 0.13 on explanatory power. Both are therefore published with their full statistics and both are priced — AED 4.85 on the measurement used, AED 3.91 on the cross-check, a 19% difference in the cash-flow value. A reader who prefers the Dubai measurement can read the second figure as this study's own, already-computed answer; it is not hidden in a sensitivity table.</w:t>
+        <w:t>On the index the beta is measured against — stated plainly, because it is the second most consequential number in this valuation after the fuel path. This share is listed in Dubai, and the natural regressor would be a Dubai general index. No Dubai general-index series is held for this purpose, so every company measured this way stands on the FTSE Abu Dhabi general index instead, one UAE market proxy standing in for the other. That substitution is better supported than it sounds: across five years of weekly returns the Abu Dhabi index explains the Dubai-listed shares BETTER than it explains the Abu Dhabi-listed ones it actually covers (median R² 0.240 against 0.127), and every one of those Dubai names clears the minimum usability threshold. It is nonetheless a substitute, and for THIS share it is the weaker of the two available measurements: 0.40 against 0.13 on explanatory power. Both are therefore published with their full statistics and both are priced — AED 4.75 on the measurement used, AED 3.83 on the cross-check, a 19% difference in the cash-flow value. A reader who prefers the Dubai measurement can read the second figure as this study's own, already-computed answer; it is not hidden in a sensitivity table.</w:t>
       </w:r>
     </w:p>
     <w:p>
@@ -6827,7 +6827,7 @@
                 <w:color w:val="1C3A36"/>
                 <w:sz w:val="17"/>
               </w:rPr>
-              <w:t>5.96</w:t>
+              <w:t>5.82</w:t>
             </w:r>
           </w:p>
         </w:tc>
@@ -6845,7 +6845,7 @@
                 <w:color w:val="1C3A36"/>
                 <w:sz w:val="17"/>
               </w:rPr>
-              <w:t>5.38</w:t>
+              <w:t>5.26</w:t>
             </w:r>
           </w:p>
         </w:tc>
@@ -6863,7 +6863,7 @@
                 <w:color w:val="1C3A36"/>
                 <w:sz w:val="17"/>
               </w:rPr>
-              <w:t>4.85</w:t>
+              <w:t>4.75</w:t>
             </w:r>
           </w:p>
         </w:tc>
@@ -6881,7 +6881,7 @@
                 <w:color w:val="1C3A36"/>
                 <w:sz w:val="17"/>
               </w:rPr>
-              <w:t>4.33</w:t>
+              <w:t>4.23</w:t>
             </w:r>
           </w:p>
         </w:tc>
@@ -6899,7 +6899,7 @@
                 <w:color w:val="1C3A36"/>
                 <w:sz w:val="17"/>
               </w:rPr>
-              <w:t>3.91</w:t>
+              <w:t>3.83</w:t>
             </w:r>
           </w:p>
         </w:tc>
@@ -6936,7 +6936,7 @@
                 <w:color w:val="1C3A36"/>
                 <w:sz w:val="17"/>
               </w:rPr>
-              <w:t>6.44</w:t>
+              <w:t>6.31</w:t>
             </w:r>
           </w:p>
         </w:tc>
@@ -6954,7 +6954,7 @@
                 <w:color w:val="1C3A36"/>
                 <w:sz w:val="17"/>
               </w:rPr>
-              <w:t>5.65</w:t>
+              <w:t>5.53</w:t>
             </w:r>
           </w:p>
         </w:tc>
@@ -6972,7 +6972,7 @@
                 <w:color w:val="1C3A36"/>
                 <w:sz w:val="17"/>
               </w:rPr>
-              <w:t>4.85</w:t>
+              <w:t>4.75</w:t>
             </w:r>
           </w:p>
         </w:tc>
@@ -6990,7 +6990,7 @@
                 <w:color w:val="1C3A36"/>
                 <w:sz w:val="17"/>
               </w:rPr>
-              <w:t>4.05</w:t>
+              <w:t>3.97</w:t>
             </w:r>
           </w:p>
         </w:tc>
@@ -7008,7 +7008,7 @@
                 <w:color w:val="1C3A36"/>
                 <w:sz w:val="17"/>
               </w:rPr>
-              <w:t>3.26</w:t>
+              <w:t>3.19</w:t>
             </w:r>
           </w:p>
         </w:tc>
@@ -7045,7 +7045,7 @@
                 <w:color w:val="1C3A36"/>
                 <w:sz w:val="17"/>
               </w:rPr>
-              <w:t>4.02</w:t>
+              <w:t>3.93</w:t>
             </w:r>
           </w:p>
         </w:tc>
@@ -7063,7 +7063,7 @@
                 <w:color w:val="1C3A36"/>
                 <w:sz w:val="17"/>
               </w:rPr>
-              <w:t>4.44</w:t>
+              <w:t>4.34</w:t>
             </w:r>
           </w:p>
         </w:tc>
@@ -7081,7 +7081,7 @@
                 <w:color w:val="1C3A36"/>
                 <w:sz w:val="17"/>
               </w:rPr>
-              <w:t>4.85</w:t>
+              <w:t>4.75</w:t>
             </w:r>
           </w:p>
         </w:tc>
@@ -7099,7 +7099,7 @@
                 <w:color w:val="1C3A36"/>
                 <w:sz w:val="17"/>
               </w:rPr>
-              <w:t>5.26</w:t>
+              <w:t>5.15</w:t>
             </w:r>
           </w:p>
         </w:tc>
@@ -7117,7 +7117,7 @@
                 <w:color w:val="1C3A36"/>
                 <w:sz w:val="17"/>
               </w:rPr>
-              <w:t>5.68</w:t>
+              <w:t>5.56</w:t>
             </w:r>
           </w:p>
         </w:tc>
@@ -7154,7 +7154,7 @@
                 <w:color w:val="1C3A36"/>
                 <w:sz w:val="17"/>
               </w:rPr>
-              <w:t>2.99</w:t>
+              <w:t>2.92</w:t>
             </w:r>
           </w:p>
         </w:tc>
@@ -7172,7 +7172,7 @@
                 <w:color w:val="1C3A36"/>
                 <w:sz w:val="17"/>
               </w:rPr>
-              <w:t>3.92</w:t>
+              <w:t>3.83</w:t>
             </w:r>
           </w:p>
         </w:tc>
@@ -7190,7 +7190,7 @@
                 <w:color w:val="1C3A36"/>
                 <w:sz w:val="17"/>
               </w:rPr>
-              <w:t>4.85</w:t>
+              <w:t>4.75</w:t>
             </w:r>
           </w:p>
         </w:tc>
@@ -7208,7 +7208,7 @@
                 <w:color w:val="1C3A36"/>
                 <w:sz w:val="17"/>
               </w:rPr>
-              <w:t>5.78</w:t>
+              <w:t>5.66</w:t>
             </w:r>
           </w:p>
         </w:tc>
@@ -7226,7 +7226,7 @@
                 <w:color w:val="1C3A36"/>
                 <w:sz w:val="17"/>
               </w:rPr>
-              <w:t>6.71</w:t>
+              <w:t>6.57</w:t>
             </w:r>
           </w:p>
         </w:tc>
@@ -7263,7 +7263,7 @@
                 <w:color w:val="1C3A36"/>
                 <w:sz w:val="17"/>
               </w:rPr>
-              <w:t>5.36</w:t>
+              <w:t>5.26</w:t>
             </w:r>
           </w:p>
         </w:tc>
@@ -7281,7 +7281,7 @@
                 <w:color w:val="1C3A36"/>
                 <w:sz w:val="17"/>
               </w:rPr>
-              <w:t>5.11</w:t>
+              <w:t>5.00</w:t>
             </w:r>
           </w:p>
         </w:tc>
@@ -7299,7 +7299,7 @@
                 <w:color w:val="1C3A36"/>
                 <w:sz w:val="17"/>
               </w:rPr>
-              <w:t>4.85</w:t>
+              <w:t>4.75</w:t>
             </w:r>
           </w:p>
         </w:tc>
@@ -7317,7 +7317,7 @@
                 <w:color w:val="1C3A36"/>
                 <w:sz w:val="17"/>
               </w:rPr>
-              <w:t>4.47</w:t>
+              <w:t>4.36</w:t>
             </w:r>
           </w:p>
         </w:tc>
@@ -7335,7 +7335,7 @@
                 <w:color w:val="1C3A36"/>
                 <w:sz w:val="17"/>
               </w:rPr>
-              <w:t>4.08</w:t>
+              <w:t>3.98</w:t>
             </w:r>
           </w:p>
         </w:tc>
@@ -7372,7 +7372,7 @@
                 <w:color w:val="1C3A36"/>
                 <w:sz w:val="17"/>
               </w:rPr>
-              <w:t>4.85</w:t>
+              <w:t>4.75</w:t>
             </w:r>
           </w:p>
         </w:tc>
@@ -7390,7 +7390,7 @@
                 <w:color w:val="1C3A36"/>
                 <w:sz w:val="17"/>
               </w:rPr>
-              <w:t>5.11</w:t>
+              <w:t>5.00</w:t>
             </w:r>
           </w:p>
         </w:tc>
@@ -7408,7 +7408,7 @@
                 <w:color w:val="1C3A36"/>
                 <w:sz w:val="17"/>
               </w:rPr>
-              <w:t>5.27</w:t>
+              <w:t>5.17</w:t>
             </w:r>
           </w:p>
         </w:tc>
@@ -7426,7 +7426,7 @@
                 <w:color w:val="1C3A36"/>
                 <w:sz w:val="17"/>
               </w:rPr>
-              <w:t>5.40</w:t>
+              <w:t>5.29</w:t>
             </w:r>
           </w:p>
         </w:tc>
@@ -7444,7 +7444,7 @@
                 <w:color w:val="1C3A36"/>
                 <w:sz w:val="17"/>
               </w:rPr>
-              <w:t>5.61</w:t>
+              <w:t>5.50</w:t>
             </w:r>
           </w:p>
         </w:tc>
@@ -7481,7 +7481,7 @@
                 <w:color w:val="1C3A36"/>
                 <w:sz w:val="17"/>
               </w:rPr>
-              <w:t>4.67</w:t>
+              <w:t>4.56</w:t>
             </w:r>
           </w:p>
         </w:tc>
@@ -7499,7 +7499,7 @@
                 <w:color w:val="1C3A36"/>
                 <w:sz w:val="17"/>
               </w:rPr>
-              <w:t>4.76</w:t>
+              <w:t>4.65</w:t>
             </w:r>
           </w:p>
         </w:tc>
@@ -7517,7 +7517,7 @@
                 <w:color w:val="1C3A36"/>
                 <w:sz w:val="17"/>
               </w:rPr>
-              <w:t>4.85</w:t>
+              <w:t>4.75</w:t>
             </w:r>
           </w:p>
         </w:tc>
@@ -7535,7 +7535,7 @@
                 <w:color w:val="1C3A36"/>
                 <w:sz w:val="17"/>
               </w:rPr>
-              <w:t>4.94</w:t>
+              <w:t>4.84</w:t>
             </w:r>
           </w:p>
         </w:tc>
@@ -7553,7 +7553,7 @@
                 <w:color w:val="1C3A36"/>
                 <w:sz w:val="17"/>
               </w:rPr>
-              <w:t>5.04</w:t>
+              <w:t>4.93</w:t>
             </w:r>
           </w:p>
         </w:tc>
@@ -7575,7 +7575,7 @@
           <w:color w:val="6E7B77"/>
           <w:sz w:val="17"/>
         </w:rPr>
-        <w:t>Each cell is a complete revaluation at the perturbed driver, all else held. Where the perturbation moves the cost of capital, the accretion from the balance-sheet date to the pricing date moves with it — the accretion is a cost-of-equity effect, so holding it fixed while changing the rate would be inconsistent. (An earlier edition did hold it fixed, which left the base column of the rate rows reading AED 3.54 against a headline of 4.85; corrected, and the agreement is now checked automatically on every rebuild.) The middle column is the base value of AED 4.85 on every row EXCEPT the JV row, whose base (the audited carrying value) is its leftmost column — the remaining columns price successively richer JV framings — and the beta row, whose RIGHTMOST column is the Dubai-index cross-check described in 1.8.</w:t>
+        <w:t>Each cell is a complete revaluation at the perturbed driver, all else held. Where the perturbation moves the cost of capital, the accretion from the balance-sheet date to the pricing date moves with it — the accretion is a cost-of-equity effect, so holding it fixed while changing the rate would be inconsistent. (An earlier edition did hold it fixed, which left the base column of the rate rows reading AED 3.54 against a headline of 4.75; corrected, and the agreement is now checked automatically on every rebuild.) The middle column is the base value of AED 4.75 on every row EXCEPT the JV row, whose base (the audited carrying value) is its leftmost column — the remaining columns price successively richer JV framings — and the beta row, whose RIGHTMOST column is the Dubai-index cross-check described in 1.8.</w:t>
       </w:r>
     </w:p>
     <w:p>
@@ -9463,7 +9463,7 @@
           <w:color w:val="1C3A36"/>
           <w:sz w:val="21"/>
         </w:rPr>
-        <w:t>The three lens bases sit between AED 3.81 and AED 5.20 — a cluster 2% below the market price. The market, in other words, is already paying for the JV-capitalised framing plus some of the order book's post-2030 tail. That is not irrational; it is simply not conservative, and this study's job is to show exactly which assumptions you must accept to get there.</w:t>
+        <w:t>The three lens bases sit between AED 3.81 and AED 5.20 — a cluster 5% below the market price. The market, in other words, is already paying for the JV-capitalised framing plus some of the order book's post-2030 tail. That is not irrational; it is simply not conservative, and this study's job is to show exactly which assumptions you must accept to get there.</w:t>
       </w:r>
     </w:p>
     <w:p>

</xml_diff>